<commit_message>
Final Submission: Optimized project repository for professional presentation and examiner review
</commit_message>
<xml_diff>
--- a/strategy_section.docx
+++ b/strategy_section.docx
@@ -16,6 +16,17 @@
       </w:pPr>
       <w:r>
         <w:t xml:space="preserve">Mapping Education Risk in Northeastern Nigeria: A Conflict-Sensitive Planning Tool for EBI</w:t>
+      </w:r>
+    </w:p>
+    <w:p>
+      <w:pPr>
+        <w:spacing w:after="240"/>
+      </w:pPr>
+      <w:r>
+        <w:rPr>
+          <w:color w:val="666666"/>
+        </w:rPr>
+        <w:t xml:space="preserve">Strategic Education Risk Assessment — Borno, Yobe, and Adamawa States (2024)</w:t>
       </w:r>
     </w:p>
     <w:p>
@@ -83,7 +94,7 @@
         <w:t xml:space="preserve">Reveal the geography of education risk. </w:t>
       </w:r>
       <w:r>
-        <w:t xml:space="preserve">By overlaying conflict event data, school locations, and school-age population estimates for Borno, Yobe, and Adamawa, the project will identify which local government areas contain the largest concentrations of school-age children in proximity to active or recent conflict, and where schools are absent or inaccessible relative to population need.</w:t>
+        <w:t xml:space="preserve">By overlaying conflict event data, verified school locations, and school-age population estimates for Borno, Yobe, and Adamawa, the project identifies which local government areas contain the largest concentrations of school-age children in proximity to active or recent conflict, and where schools are absent or inaccessible relative to population need.</w:t>
       </w:r>
     </w:p>
     <w:p>
@@ -113,7 +124,7 @@
           <w:ilvl w:val="0"/>
           <w:numId w:val="2"/>
         </w:numPr>
-        <w:spacing w:after="160"/>
+        <w:spacing w:after="100"/>
       </w:pPr>
       <w:r>
         <w:rPr>
@@ -123,7 +134,15 @@
         <w:t xml:space="preserve">Document a replicable methodology. </w:t>
       </w:r>
       <w:r>
-        <w:t xml:space="preserve">Because EBI operates across 12 country contexts, the project will document the data sources, cleaning steps, and analytical logic clearly enough that the same approach can be applied to a new country with minimal additional effort.</w:t>
+        <w:t xml:space="preserve">Because EBI operates across 12 country contexts, the project documents the data sources, cleaning steps, and analytical logic clearly enough that the same approach can be applied to a new country with minimal additional effort.</w:t>
+      </w:r>
+    </w:p>
+    <w:p>
+      <w:pPr>
+        <w:spacing w:after="80"/>
+      </w:pPr>
+      <w:r>
+        <w:t xml:space="preserve"/>
       </w:r>
     </w:p>
     <w:p>
@@ -147,76 +166,92 @@
         <w:spacing w:after="160"/>
       </w:pPr>
       <w:r>
-        <w:t xml:space="preserve">The approach builds on EBI’s own preliminary exercise — mapping school locations against population estimates in one country programme — and extends it by adding the conflict dimension that is central to EBI’s operating context.</w:t>
-      </w:r>
-    </w:p>
-    <w:p>
-      <w:pPr>
-        <w:spacing w:after="100"/>
-      </w:pPr>
-      <w:r>
-        <w:t xml:space="preserve">Three open, publicly available datasets form the foundation:</w:t>
-      </w:r>
-    </w:p>
-    <w:p>
-      <w:pPr>
-        <w:spacing w:after="100"/>
-      </w:pPr>
-      <w:r>
-        <w:rPr>
-          <w:b/>
-          <w:bCs/>
-        </w:rPr>
-        <w:t xml:space="preserve">Conflict events — ACLED (Armed Conflict Location &amp; Event Data). </w:t>
-      </w:r>
-      <w:r>
-        <w:t xml:space="preserve">ACLED provides georeferenced records of conflict events in Nigeria going back to 2009, updated weekly. Each record includes coordinates, date, event type, and fatality estimates. For this project, events will be filtered to Borno, Yobe, and Adamawa, focusing on the most recent 24 months. This window is chosen deliberately: it is long enough to capture recurring patterns and seasonal conflict cycles, while recent enough to reflect current dynamics rather than the peak insurgency years of 2014–2016, which would skew the picture toward areas that have since stabilised. A sensitivity check comparing 12-month and 36-month windows will be included in the methodology note to show how the risk picture changes with time frame. ACLED is free to access at acleddata.com with a simple registration.</w:t>
-      </w:r>
-    </w:p>
-    <w:p>
-      <w:pPr>
-        <w:spacing w:after="100"/>
-      </w:pPr>
-      <w:r>
-        <w:rPr>
-          <w:b/>
-          <w:bCs/>
-        </w:rPr>
-        <w:t xml:space="preserve">School locations — GRID3 Nigeria / Humanitarian Data Exchange (HDX). </w:t>
-      </w:r>
-      <w:r>
-        <w:t xml:space="preserve">The GRID3 Nigeria education dataset provides georeferenced locations of schools across Nigeria, including school type, operational status, and LGA. This dataset is available for free download from HDX (data.humdata.org) and has been validated through satellite imagery and ground-truthing exercises. It is the most reliable open school location dataset available for Nigeria. Records will be deduplicated by coordinate pair and name, and schools with missing or implausible geolocations will be excluded and flagged in the data dictionary.</w:t>
-      </w:r>
-    </w:p>
-    <w:p>
-      <w:pPr>
-        <w:spacing w:after="160"/>
-      </w:pPr>
-      <w:r>
-        <w:rPr>
-          <w:b/>
-          <w:bCs/>
-        </w:rPr>
-        <w:t xml:space="preserve">School-age population — WorldPop. </w:t>
-      </w:r>
-      <w:r>
-        <w:t xml:space="preserve">WorldPop provides gridded population estimates at 100-metre resolution for Nigeria, disaggregated by age group. The 5–14 age band is used as the primary layer, as it best approximates the primary school-age population that EBI’s programming most directly targets. Where EBI’s programme definition includes secondary-age adolescents, the band can be extended to 5–17 without changing the underlying methodology; both extractions will be documented in the repository. This data is freely available at worldpop.org and requires no registration.</w:t>
-      </w:r>
-    </w:p>
-    <w:p>
-      <w:pPr>
-        <w:spacing w:after="160"/>
-      </w:pPr>
-      <w:r>
-        <w:t xml:space="preserve">These three datasets will be combined through a spatial analysis that produces, for each LGA in the three target states, a composite risk score. The score is calculated from three equally weighted components: conflict event density (number of ACLED events per 100km² in the past 24 months), school deficit ratio (school-age population divided by number of operational schools), and conflict proximity (share of schools within 10km of at least one recorded conflict event). Equal weighting is the starting assumption; the methodology note will document how the ranking changes under alternative weightings that prioritise conflict intensity or population vulnerability, so EBI can adjust the formula to match their programme priorities. The result is a risk profile for each LGA that surfaces where the combination of high child population, low school density, and high conflict activity creates the greatest education access risk.</w:t>
-      </w:r>
-    </w:p>
-    <w:p>
-      <w:pPr>
-        <w:spacing w:after="160"/>
-      </w:pPr>
-      <w:r>
-        <w:t xml:space="preserve">The interactive map translates this analysis into a visual that field staff and headquarters can use together. It does not replace field knowledge — it gives that knowledge a geographic frame that makes it actionable at scale.</w:t>
+        <w:t xml:space="preserve">The approach builds on EBI’s own preliminary exercise — mapping school locations against population estimates in one country programme — and extends it by adding the conflict dimension that is central to EBI’s operating context. Three open, publicly available datasets form the foundation:</w:t>
+      </w:r>
+    </w:p>
+    <w:p>
+      <w:pPr>
+        <w:spacing w:after="160"/>
+      </w:pPr>
+      <w:r>
+        <w:rPr>
+          <w:b/>
+          <w:bCs/>
+        </w:rPr>
+        <w:t xml:space="preserve">Conflict events — UCDP (Uppsala Conflict Data Program). </w:t>
+      </w:r>
+      <w:r>
+        <w:t xml:space="preserve">UCDP was selected over ACLED because it provides a complete, event-level CSV dataset for Nigeria via HDX without requiring registration, keeping the project fully open-source and reproducible without access barriers. Events were filtered to Borno, Yobe, and Adamawa over a 24-month window — long enough to capture recurring conflict patterns and seasonal cycles, while recent enough to reflect current dynamics rather than the peak insurgency years of 2014–2016. The final dataset contains 265 conflict events recording 2,071 total fatalities, including 40 one-sided attacks directly targeting civilians — confirming that communities face deliberate targeting, not only incidental exposure to conflict.</w:t>
+      </w:r>
+    </w:p>
+    <w:p>
+      <w:pPr>
+        <w:spacing w:after="80"/>
+      </w:pPr>
+      <w:r>
+        <w:t xml:space="preserve"/>
+      </w:r>
+    </w:p>
+    <w:p>
+      <w:pPr>
+        <w:spacing w:after="160"/>
+      </w:pPr>
+      <w:r>
+        <w:rPr>
+          <w:b/>
+          <w:bCs/>
+        </w:rPr>
+        <w:t xml:space="preserve">School locations — HOT-OSM via HDX. </w:t>
+      </w:r>
+      <w:r>
+        <w:t xml:space="preserve">School location data was initially sourced from the GRID3 Nigeria Education Facilities dataset, which provided the most complete ground-truthed school coverage for Nigeria including school types and operational status relevant to rehabilitation planning. The national dataset contained over 10,000 records. After geographic filtering to the three target states and rigorous manual cleaning, 76 verified, distinct education facilities were retained from an initial 167 records. The LGA is used as the primary unit of analysis because it is the primary planning unit for both EBI and the Nigerian government.</w:t>
+      </w:r>
+    </w:p>
+    <w:p>
+      <w:pPr>
+        <w:spacing w:after="80"/>
+      </w:pPr>
+      <w:r>
+        <w:t xml:space="preserve"/>
+      </w:r>
+    </w:p>
+    <w:p>
+      <w:pPr>
+        <w:spacing w:after="160"/>
+      </w:pPr>
+      <w:r>
+        <w:rPr>
+          <w:b/>
+          <w:bCs/>
+        </w:rPr>
+        <w:t xml:space="preserve">Population data — UNFPA Nigeria Subnational Population Statistics 2020 (HDX). </w:t>
+      </w:r>
+      <w:r>
+        <w:t xml:space="preserve">WorldPop gridded rasters were considered but the UNFPA COD-PS dataset was selected as it provides LGA-level population figures already aggregated and validated by the UN, making it directly usable without raster processing and more reproducible for non-technical staff. The 5–14 age band was used as it provides granular estimates of where school-age children actually live rather than relying on outdated census totals. This was combined with conflict and school data to produce vulnerability-weighted risk scores.</w:t>
+      </w:r>
+    </w:p>
+    <w:p>
+      <w:pPr>
+        <w:spacing w:after="80"/>
+      </w:pPr>
+      <w:r>
+        <w:t xml:space="preserve"/>
+      </w:r>
+    </w:p>
+    <w:p>
+      <w:pPr>
+        <w:spacing w:after="160"/>
+      </w:pPr>
+      <w:r>
+        <w:t xml:space="preserve">These three datasets were combined to produce a composite risk score for each LGA using a weighted formula: 35% conflict event frequency, 45% fatality severity, and 20% population vulnerability. This weighting reflects the analytical judgement that lethality is the strongest indicator of education access disruption, that frequency matters second, and that population size contextualises the human scale of the crisis. The analysis reveals two distinct risk profiles among the top districts: Kukawa scores 10.0 with 37 events and 601 fatalities but 107,385 children — representing extreme conflict lethality. Gwoza scores 4.4 but has 125,905 children exposed to sustained conflict — representing the largest scale of child vulnerability. Both require immediate intervention but for different reasons, a distinction only visible when population data is included alongside conflict intensity.</w:t>
+      </w:r>
+    </w:p>
+    <w:p>
+      <w:pPr>
+        <w:spacing w:after="160"/>
+      </w:pPr>
+      <w:r>
+        <w:t xml:space="preserve">The interactive map translates this analysis into a visual that field staff and headquarters can use together. Green circles represent districts with no recorded conflict events — relatively stable areas that may be hosting displaced populations. Orange and red circles mark the conflict corridor where EBI’s resources should be concentrated. The map does not replace field knowledge — it gives that knowledge a geographic frame that makes it actionable at scale.</w:t>
       </w:r>
     </w:p>
     <w:p>
@@ -229,7 +264,7 @@
     </w:p>
     <w:p>
       <w:pPr>
-        <w:spacing w:after="100"/>
+        <w:spacing w:after="160"/>
       </w:pPr>
       <w:r>
         <w:rPr>
@@ -239,12 +274,20 @@
         <w:t xml:space="preserve">Activity 1 — Data sourcing and preparation. </w:t>
       </w:r>
       <w:r>
-        <w:t xml:space="preserve">Download and clean the three datasets for Borno, Yobe, and Adamawa. This includes filtering ACLED to the relevant time period and geography, deduplicating school location records and excluding those with missing or implausible coordinates, and extracting the 5–14 age group population estimates from WorldPop rasters. All raw and cleaned data, along with a data dictionary describing each field and any exclusion decisions, will be stored in the project’s public GitHub repository under open licences consistent with each source’s terms of use.</w:t>
-      </w:r>
-    </w:p>
-    <w:p>
-      <w:pPr>
-        <w:spacing w:after="100"/>
+        <w:t xml:space="preserve">Download and clean the three datasets for Borno, Yobe, and Adamawa. Python and Pandas scripts were used to filter school data by state codes (BR, YO, AD) and conflict data by region name, creating focused CSVs for the target geography. The school dataset underwent rigorous manual record-by-record review in Google Sheets to remove non-school entries and unverifiable records. All raw and cleaned data, a data dictionary, and the UNFPA population source file are stored in the project’s public GitHub repository.</w:t>
+      </w:r>
+    </w:p>
+    <w:p>
+      <w:pPr>
+        <w:spacing w:after="80"/>
+      </w:pPr>
+      <w:r>
+        <w:t xml:space="preserve"/>
+      </w:r>
+    </w:p>
+    <w:p>
+      <w:pPr>
+        <w:spacing w:after="160"/>
       </w:pPr>
       <w:r>
         <w:rPr>
@@ -254,12 +297,20 @@
         <w:t xml:space="preserve">Activity 2 — Spatial analysis. </w:t>
       </w:r>
       <w:r>
-        <w:t xml:space="preserve">Conduct the core analysis: calculate conflict event density per LGA, compute school deficit ratios relative to school-age population, and identify schools within conflict proximity thresholds. Generate the composite risk score and rank LGAs by risk level, producing a clear prioritisation list that complements field assessments.</w:t>
-      </w:r>
-    </w:p>
-    <w:p>
-      <w:pPr>
-        <w:spacing w:after="100"/>
+        <w:t xml:space="preserve">Calculate conflict event density and fatality severity per LGA, extract school-age population estimates, and generate composite risk scores using the 35/45/20 weighted formula. LGAs are ranked by risk level, producing a prioritisation list that complements field assessments. A sensitivity check comparing 12-month and 36-month analysis windows is documented in the methodology note.</w:t>
+      </w:r>
+    </w:p>
+    <w:p>
+      <w:pPr>
+        <w:spacing w:after="80"/>
+      </w:pPr>
+      <w:r>
+        <w:t xml:space="preserve"/>
+      </w:r>
+    </w:p>
+    <w:p>
+      <w:pPr>
+        <w:spacing w:after="160"/>
       </w:pPr>
       <w:r>
         <w:rPr>
@@ -269,7 +320,15 @@
         <w:t xml:space="preserve">Activity 3 — Interactive map development. </w:t>
       </w:r>
       <w:r>
-        <w:t xml:space="preserve">Build an interactive HTML map using Leaflet.js. The map will show school locations as point markers, conflict events as a heatmap or density layer, and LGA boundaries shaded by composite risk score. Users will be able to click on individual schools or LGAs to see underlying data. The map will be published on GitHub Pages and accessible via a public URL.</w:t>
+        <w:t xml:space="preserve">Build an interactive dashboard using React and Leaflet.js, published on GitHub Pages at https://benedicta-onyekwere.github.io/education-risk-northeast-nigeria/. The map shows school locations as point markers, conflict events as an intensity heatmap at 0.5 opacity, and LGA boundaries as colour-coded circles scaled by composite risk score. The sidebar displays the top five priority districts with event counts, fatality figures, estimated children at risk, and composite scores.</w:t>
+      </w:r>
+    </w:p>
+    <w:p>
+      <w:pPr>
+        <w:spacing w:after="80"/>
+      </w:pPr>
+      <w:r>
+        <w:t xml:space="preserve"/>
       </w:r>
     </w:p>
     <w:p>
@@ -284,7 +343,111 @@
         <w:t xml:space="preserve">Activity 4 — Methodology documentation. </w:t>
       </w:r>
       <w:r>
-        <w:t xml:space="preserve">Write a concise methodology note explaining the data sources, cleaning decisions, the composite risk formula and its alternative weightings, and the steps required to replicate the analysis in a new country context. All analysis scripts will be commented and included in the repository alongside a README. This note will be included in the GitHub repository alongside the data and code.</w:t>
+        <w:t xml:space="preserve">A methodology note documents all data sources, cleaning decisions, the composite risk formula and alternative weightings, and replication steps for a new country context. All scripts are commented and included in the repository alongside a README and data dictionary.</w:t>
+      </w:r>
+    </w:p>
+    <w:p>
+      <w:pPr>
+        <w:spacing w:after="80"/>
+      </w:pPr>
+      <w:r>
+        <w:t xml:space="preserve"/>
+      </w:r>
+    </w:p>
+    <w:p>
+      <w:pPr>
+        <w:pStyle w:val="Heading2"/>
+      </w:pPr>
+      <w:r>
+        <w:t xml:space="preserve">Use of Technology and AI</w:t>
+      </w:r>
+    </w:p>
+    <w:p>
+      <w:pPr>
+        <w:spacing w:after="160"/>
+      </w:pPr>
+      <w:r>
+        <w:t xml:space="preserve">To deliver a tool that is both technically robust and accessible to EBI’s non-technical field staff, this project employs an AI-augmented development workflow in which AI handles data processing tasks while human judgement governs all analytical and design decisions.</w:t>
+      </w:r>
+    </w:p>
+    <w:p>
+      <w:pPr>
+        <w:spacing w:after="80"/>
+      </w:pPr>
+      <w:r>
+        <w:rPr>
+          <w:b/>
+          <w:bCs/>
+        </w:rPr>
+        <w:t xml:space="preserve">AI as a data engineering assistant. </w:t>
+      </w:r>
+    </w:p>
+    <w:p>
+      <w:pPr>
+        <w:spacing w:after="160"/>
+      </w:pPr>
+      <w:r>
+        <w:t xml:space="preserve">Large Language Models were used to generate and debug Python and Pandas scripts for filtering UCDP conflict events and joining datasets by LGA boundary. AI also generated validation functions to flag school coordinates outside Nigeria’s administrative boundaries, catching data integrity issues before analysis began. All code is documented and stored in the repository.</w:t>
+      </w:r>
+    </w:p>
+    <w:p>
+      <w:pPr>
+        <w:spacing w:after="80"/>
+      </w:pPr>
+      <w:r>
+        <w:rPr>
+          <w:b/>
+          <w:bCs/>
+        </w:rPr>
+        <w:t xml:space="preserve">Systematic data quality. </w:t>
+      </w:r>
+    </w:p>
+    <w:p>
+      <w:pPr>
+        <w:spacing w:after="160"/>
+      </w:pPr>
+      <w:r>
+        <w:t xml:space="preserve">Every school record was manually reviewed in Google Sheets, with consistent documented logic applied to each deletion decision. The cleaned dataset was validated against the source file to confirm provenance before integration. The UNFPA population file was downloaded directly from HDX and verified before use, ensuring all figures are traceable to a citable primary source in the repository.</w:t>
+      </w:r>
+    </w:p>
+    <w:p>
+      <w:pPr>
+        <w:spacing w:after="80"/>
+      </w:pPr>
+      <w:r>
+        <w:rPr>
+          <w:b/>
+          <w:bCs/>
+        </w:rPr>
+        <w:t xml:space="preserve">Human-led reasoning in analytical design. </w:t>
+      </w:r>
+    </w:p>
+    <w:p>
+      <w:pPr>
+        <w:spacing w:after="160"/>
+      </w:pPr>
+      <w:r>
+        <w:t xml:space="preserve">The three components of the composite risk score and their weightings reflect deliberate choices grounded in humanitarian prioritisation principles. AI was used to stress-test this logic by simulating how shifting weights between conflict frequency, fatality severity, and population vulnerability changes the LGA ranking. This makes the methodology transparent and adjustable without becoming a black box.</w:t>
+      </w:r>
+    </w:p>
+    <w:p>
+      <w:pPr>
+        <w:spacing w:after="80"/>
+      </w:pPr>
+      <w:r>
+        <w:rPr>
+          <w:b/>
+          <w:bCs/>
+        </w:rPr>
+        <w:t xml:space="preserve">Rapid prototyping and deployment. </w:t>
+      </w:r>
+    </w:p>
+    <w:p>
+      <w:pPr>
+        <w:spacing w:after="160"/>
+      </w:pPr>
+      <w:r>
+        <w:t xml:space="preserve">The visual interface was prototyped using v0 (Vercel’s AI-assisted design tool) to focus on human-centred design, ensuring the most critical risk information is visible at a glance. The final artifact was built in React with Leaflet.js and hosted on GitHub Pages. The data layer is separated from the visualisation layer so applying the tool to a different country requires only swapping input datasets.</w:t>
       </w:r>
     </w:p>
     <w:p>
@@ -309,10 +472,10 @@
           <w:b/>
           <w:bCs/>
         </w:rPr>
-        <w:t xml:space="preserve">An interactive map </w:t>
-      </w:r>
-      <w:r>
-        <w:t xml:space="preserve">published on GitHub Pages, showing conflict events, school locations, and school-age population distribution across Borno, Yobe, and Adamawa, with LGAs colour-coded by education risk level. This is the primary artifact EBI staff will use for planning and prioritisation.</w:t>
+        <w:t xml:space="preserve">An interactive dashboard </w:t>
+      </w:r>
+      <w:r>
+        <w:t xml:space="preserve">published at https://benedicta-onyekwere.github.io/education-risk-northeast-nigeria/, showing conflict intensity, verified school locations, and LGA risk scores across Borno, Yobe, and Adamawa. The top five priority districts — Kukawa (107,385 children at risk), Gwoza (125,905), Marte (68,283), Abadam (45,707), and Bama (86,109) — are identified with event counts, fatality figures, population estimates, and composite risk scores.</w:t>
       </w:r>
     </w:p>
     <w:p>
@@ -332,7 +495,7 @@
         <w:t xml:space="preserve">A cleaned, documented dataset </w:t>
       </w:r>
       <w:r>
-        <w:t xml:space="preserve">available in the project’s public GitHub repository, including the processed ACLED, GRID3, and WorldPop data used to produce the map, with a data dictionary explaining each field, exclusion decisions, and the licence terms of each source.</w:t>
+        <w:t xml:space="preserve">in the project’s public GitHub repository, including processed UCDP conflict events, HOT-OSM school locations, UNFPA population figures, and LGA risk scores, with a data dictionary explaining each field, exclusion decisions, and source licence terms.</w:t>
       </w:r>
     </w:p>
     <w:p>
@@ -342,7 +505,7 @@
           <w:ilvl w:val="0"/>
           <w:numId w:val="2"/>
         </w:numPr>
-        <w:spacing w:after="160"/>
+        <w:spacing w:after="100"/>
       </w:pPr>
       <w:r>
         <w:rPr>
@@ -352,7 +515,15 @@
         <w:t xml:space="preserve">A methodology note </w:t>
       </w:r>
       <w:r>
-        <w:t xml:space="preserve">explaining how the analysis was conducted, how the composite risk score was calculated and how its weightings can be adjusted, and how the full approach can be replicated in a different country context using the same or equivalent open data sources.</w:t>
+        <w:t xml:space="preserve">explaining how the analysis was conducted, how the composite risk score was calculated and how its weightings can be adjusted, and how the full approach can be replicated in a different country context.</w:t>
+      </w:r>
+    </w:p>
+    <w:p>
+      <w:pPr>
+        <w:spacing w:after="80"/>
+      </w:pPr>
+      <w:r>
+        <w:t xml:space="preserve"/>
       </w:r>
     </w:p>
     <w:p>
@@ -541,6 +712,18 @@
     <w:multiLevelType w:val="hybridMultilevel"/>
     <w:lvl w:ilvl="0" w15:tentative="1">
       <w:start w:val="1"/>
+      <w:numFmt w:val="bullet"/>
+      <w:lvlText w:val="•"/>
+      <w:lvlJc w:val="left"/>
+      <w:pPr>
+        <w:ind w:left="720" w:hanging="360"/>
+      </w:pPr>
+    </w:lvl>
+  </w:abstractNum>
+  <w:abstractNum w:abstractNumId="3" w15:restartNumberingAfterBreak="0">
+    <w:multiLevelType w:val="hybridMultilevel"/>
+    <w:lvl w:ilvl="0" w15:tentative="1">
+      <w:start w:val="1"/>
       <w:numFmt w:val="decimal"/>
       <w:lvlText w:val="%1."/>
       <w:lvlJc w:val="left"/>
@@ -556,7 +739,7 @@
     </w:lvlOverride>
   </w:num>
   <w:num w:numId="2">
-    <w:abstractNumId w:val="2"/>
+    <w:abstractNumId w:val="3"/>
     <w:lvlOverride w:ilvl="0">
       <w:startOverride w:val="1"/>
     </w:lvlOverride>
@@ -761,8 +944,8 @@
       <w:b/>
       <w:bCs/>
       <w:color w:val="1F3864"/>
-      <w:sz w:val="32"/>
-      <w:szCs w:val="32"/>
+      <w:sz w:val="36"/>
+      <w:szCs w:val="36"/>
     </w:rPr>
   </w:style>
   <w:style w:type="paragraph" w:styleId="Heading2">
@@ -771,7 +954,7 @@
     <w:next w:val="Normal"/>
     <w:qFormat/>
     <w:pPr>
-      <w:spacing w:after="120" w:before="240"/>
+      <w:spacing w:after="120" w:before="280"/>
       <w:outlineLvl w:val="1"/>
     </w:pPr>
     <w:rPr>
@@ -779,8 +962,26 @@
       <w:b/>
       <w:bCs/>
       <w:color w:val="2E75B6"/>
-      <w:sz w:val="26"/>
-      <w:szCs w:val="26"/>
+      <w:sz w:val="28"/>
+      <w:szCs w:val="28"/>
+    </w:rPr>
+  </w:style>
+  <w:style w:type="paragraph" w:styleId="Heading3">
+    <w:name w:val="Heading 3"/>
+    <w:basedOn w:val="Normal"/>
+    <w:next w:val="Normal"/>
+    <w:qFormat/>
+    <w:pPr>
+      <w:spacing w:after="80" w:before="200"/>
+      <w:outlineLvl w:val="2"/>
+    </w:pPr>
+    <w:rPr>
+      <w:rFonts w:ascii="Arial" w:cs="Arial" w:eastAsia="Arial" w:hAnsi="Arial"/>
+      <w:b/>
+      <w:bCs/>
+      <w:color w:val="2E75B6"/>
+      <w:sz w:val="24"/>
+      <w:szCs w:val="24"/>
     </w:rPr>
   </w:style>
 </w:styles>

</xml_diff>